<commit_message>
Correct temporal split and refresh evaluation artifacts
</commit_message>
<xml_diff>
--- a/docs/Yemen_PriceGuard_AI_Academic_Guide_AR_EN.docx
+++ b/docs/Yemen_PriceGuard_AI_Academic_Guide_AR_EN.docx
@@ -933,19 +933,17 @@
       </w:pPr>
       <w:r>
         <w:rPr>
-          <w:rFonts w:ascii="Arial" w:hAnsi="Arial" w:eastAsia="Arial"/>
-          <w:b w:val="0"/>
+          <w:rFonts w:ascii="Arial" w:hAnsi="Arial"/>
         </w:rPr>
-        <w:t>في تقسيم الاختبار الأولي: 486 سجلًا للتدريب و123 سجلًا للاختبار. لكن الاختبار يحتوي على حالتين إيجابيتين فقط؛ لذا لا تكفي نتائجه وحدها لإثبات أداء موثوق.</w:t>
+        <w:t>بعد هندسة الخصائص وتطبيق الفجوة المحافظة عند حد التقسيم: 483 سجلًا للتدريب و123 سجلًا للاختبار، مع استبعاد سجل حد فاصل واحد لكل سوق. يحتوي الاختبار على حالتين إيجابيتين فقط؛ لذا لا تكفي نتائجه وحدها لإثبات أداء موثوق.</w:t>
       </w:r>
     </w:p>
     <w:p>
       <w:r>
         <w:rPr>
-          <w:rFonts w:ascii="Arial" w:hAnsi="Arial" w:eastAsia="Arial"/>
-          <w:b w:val="0"/>
+          <w:rFonts w:ascii="Arial" w:hAnsi="Arial"/>
         </w:rPr>
-        <w:t>The initial chronological split contains 486 training rows and 123 test rows. Only two test examples are positive, making performance estimates highly uncertain.</w:t>
+        <w:t>After feature engineering and purging one boundary record per market, the chronological holdout contains 483 training rows and 123 test rows. Only two test examples are positive, so performance estimates remain highly uncertain.</w:t>
       </w:r>
     </w:p>
     <w:p>
@@ -1077,19 +1075,17 @@
       </w:pPr>
       <w:r>
         <w:rPr>
-          <w:rFonts w:ascii="Arial" w:hAnsi="Arial" w:eastAsia="Arial"/>
-          <w:b w:val="0"/>
+          <w:rFonts w:ascii="Arial" w:hAnsi="Arial"/>
         </w:rPr>
-        <w:t>العربية: Logistic Regression نموذج تصنيف يقدّر احتمال انتماء السجل إلى الفئة 1. يستخدم كخط أساس للمقارنة، وليس لأنه يضمن أفضل أداء. في التجربة المسجلة، كانت نتائجه ضعيفة: Accuracy=0.6016 وPrecision=0.0204 وRecall=0.5 وF1=0.0392.</w:t>
+        <w:t>العربية: Logistic Regression نموذج تصنيف يقدّر احتمال انتماء السجل إلى الفئة 1. يستخدم للمقارنة، وليس لأنه يضمن أفضل أداء. بعد الفجوة الزمنية المحافظة في تقسيم الاختبار، كانت نتائجه: Accuracy=0.6016 وPrecision=0.0204 وRecall=0.5000 وF1=0.0392. وتبقى هذه المقاييس غير مستقرة بسبب وجود حالتين إيجابيتين فقط.</w:t>
       </w:r>
     </w:p>
     <w:p>
       <w:r>
         <w:rPr>
-          <w:rFonts w:ascii="Arial" w:hAnsi="Arial" w:eastAsia="Arial"/>
-          <w:b w:val="0"/>
+          <w:rFonts w:ascii="Arial" w:hAnsi="Arial"/>
         </w:rPr>
-        <w:t>English: Logistic Regression estimates the probability of the positive class and serves as a baseline. In the recorded experiment, performance was weak: Accuracy 0.6016, Precision 0.0204, Recall 0.50, and F1 0.0392.</w:t>
+        <w:t>English: Logistic Regression estimates the probability of the positive class and serves as a comparison baseline. After applying the conservative temporal boundary gap, the metrics were Accuracy 0.6016, Precision 0.0204, Recall 0.5000, and F1 0.0392. These estimates remain unstable because the test set contains only two positive cases.</w:t>
       </w:r>
     </w:p>
     <w:p>
@@ -1190,19 +1186,17 @@
       </w:pPr>
       <w:r>
         <w:rPr>
-          <w:rFonts w:ascii="Arial" w:hAnsi="Arial" w:eastAsia="Arial"/>
-          <w:b w:val="0"/>
+          <w:rFonts w:ascii="Arial" w:hAnsi="Arial"/>
         </w:rPr>
-        <w:t>في اختبار التقسيم الأولي، كانت النتائج: Accuracy=0.9675، Precision=0.25، Recall=0.50، F1=0.3333. ومصفوفة الالتباس كانت [[118, 3], [1, 1]] وفق ترتيب [TN, FP; FN, TP]. لكن وجود حالتين إيجابيتين فقط يجعل هذه الأرقام شديدة الحساسية لأي حالة واحدة.</w:t>
+        <w:t>في تقسيم الاختبار الزمني بعد تصحيح الحد الفاصل، كانت نتائج Random Forest: Accuracy=0.8455، Precision=0.0526، Recall=0.5000، F1=0.0952. ومصفوفة الالتباس كانت [[103, 18], [1, 1]] وفق ترتيب [TN, FP; FN, TP]. هذا يعني اكتشاف حالة ارتفاع واحدة من أصل حالتين، مع 18 إنذارًا كاذبًا. ولأن عدد الحالات الإيجابية اثنتان فقط، تظل المقاييس شديدة الحساسية لكل حالة.</w:t>
       </w:r>
     </w:p>
     <w:p>
       <w:r>
         <w:rPr>
-          <w:rFonts w:ascii="Arial" w:hAnsi="Arial" w:eastAsia="Arial"/>
-          <w:b w:val="0"/>
+          <w:rFonts w:ascii="Arial" w:hAnsi="Arial"/>
         </w:rPr>
-        <w:t>On the initial test split, Accuracy was 0.9675, Precision 0.25, Recall 0.50, and F1 0.3333. The confusion matrix was [[118, 3], [1, 1]] in [TN, FP; FN, TP] order. With only two positive examples, one prediction changes the metrics substantially.</w:t>
+        <w:t>On the chronological holdout after correcting the boundary, Random Forest recorded Accuracy 0.8455, Precision 0.0526, Recall 0.5000, and F1 0.0952. Its confusion matrix was [[103, 18], [1, 1]] in [TN, FP; FN, TP] order. It detected one of two positive cases but produced 18 false alarms. With only two positives, the metrics are highly sensitive to a single case.</w:t>
       </w:r>
     </w:p>
     <w:p>
@@ -2340,7 +2334,7 @@
           </w:tcPr>
           <w:p>
             <w:r>
-              <w:t>0.1907</w:t>
+              <w:t>0.1904</w:t>
             </w:r>
           </w:p>
         </w:tc>
@@ -2372,7 +2366,7 @@
           </w:tcPr>
           <w:p>
             <w:r>
-              <w:t>0.1670</w:t>
+              <w:t>0.1525</w:t>
             </w:r>
           </w:p>
         </w:tc>
@@ -2404,7 +2398,7 @@
           </w:tcPr>
           <w:p>
             <w:r>
-              <w:t>0.1407</w:t>
+              <w:t>0.1472</w:t>
             </w:r>
           </w:p>
         </w:tc>
@@ -2426,6 +2420,38 @@
           </w:tcPr>
           <w:p>
             <w:r>
+              <w:t>price_rolling_mean_3</w:t>
+            </w:r>
+          </w:p>
+        </w:tc>
+        <w:tc>
+          <w:tcPr>
+            <w:tcW w:type="dxa" w:w="3360"/>
+          </w:tcPr>
+          <w:p>
+            <w:r>
+              <w:t>0.1313</w:t>
+            </w:r>
+          </w:p>
+        </w:tc>
+        <w:tc>
+          <w:tcPr>
+            <w:tcW w:type="dxa" w:w="3360"/>
+          </w:tcPr>
+          <w:p>
+            <w:r>
+              <w:t>متوسط الأشهر الثلاثة السابقة</w:t>
+            </w:r>
+          </w:p>
+        </w:tc>
+      </w:tr>
+      <w:tr>
+        <w:tc>
+          <w:tcPr>
+            <w:tcW w:type="dxa" w:w="3360"/>
+          </w:tcPr>
+          <w:p>
+            <w:r>
               <w:t>price_lag_1</w:t>
             </w:r>
           </w:p>
@@ -2436,7 +2462,7 @@
           </w:tcPr>
           <w:p>
             <w:r>
-              <w:t>0.1349</w:t>
+              <w:t>0.1284</w:t>
             </w:r>
           </w:p>
         </w:tc>
@@ -2458,38 +2484,6 @@
           </w:tcPr>
           <w:p>
             <w:r>
-              <w:t>price_rolling_mean_3</w:t>
-            </w:r>
-          </w:p>
-        </w:tc>
-        <w:tc>
-          <w:tcPr>
-            <w:tcW w:type="dxa" w:w="3360"/>
-          </w:tcPr>
-          <w:p>
-            <w:r>
-              <w:t>0.1241</w:t>
-            </w:r>
-          </w:p>
-        </w:tc>
-        <w:tc>
-          <w:tcPr>
-            <w:tcW w:type="dxa" w:w="3360"/>
-          </w:tcPr>
-          <w:p>
-            <w:r>
-              <w:t>متوسط الأشهر الثلاثة السابقة</w:t>
-            </w:r>
-          </w:p>
-        </w:tc>
-      </w:tr>
-      <w:tr>
-        <w:tc>
-          <w:tcPr>
-            <w:tcW w:type="dxa" w:w="3360"/>
-          </w:tcPr>
-          <w:p>
-            <w:r>
               <w:t>price_lag_2</w:t>
             </w:r>
           </w:p>
@@ -2500,7 +2494,7 @@
           </w:tcPr>
           <w:p>
             <w:r>
-              <w:t>0.1103</w:t>
+              <w:t>0.1169</w:t>
             </w:r>
           </w:p>
         </w:tc>
@@ -2532,7 +2526,7 @@
           </w:tcPr>
           <w:p>
             <w:r>
-              <w:t>0.0702</w:t>
+              <w:t>0.0690</w:t>
             </w:r>
           </w:p>
         </w:tc>
@@ -2554,6 +2548,38 @@
           </w:tcPr>
           <w:p>
             <w:r>
+              <w:t>mkt_name_Sana'a City</w:t>
+            </w:r>
+          </w:p>
+        </w:tc>
+        <w:tc>
+          <w:tcPr>
+            <w:tcW w:type="dxa" w:w="3360"/>
+          </w:tcPr>
+          <w:p>
+            <w:r>
+              <w:t>0.0243</w:t>
+            </w:r>
+          </w:p>
+        </w:tc>
+        <w:tc>
+          <w:tcPr>
+            <w:tcW w:type="dxa" w:w="3360"/>
+          </w:tcPr>
+          <w:p>
+            <w:r>
+              <w:t>مؤشر سوق صنعاء</w:t>
+            </w:r>
+          </w:p>
+        </w:tc>
+      </w:tr>
+      <w:tr>
+        <w:tc>
+          <w:tcPr>
+            <w:tcW w:type="dxa" w:w="3360"/>
+          </w:tcPr>
+          <w:p>
+            <w:r>
               <w:t>mkt_name_Dhamar City</w:t>
             </w:r>
           </w:p>
@@ -2564,7 +2590,7 @@
           </w:tcPr>
           <w:p>
             <w:r>
-              <w:t>0.0263</w:t>
+              <w:t>0.0229</w:t>
             </w:r>
           </w:p>
         </w:tc>
@@ -2586,38 +2612,6 @@
           </w:tcPr>
           <w:p>
             <w:r>
-              <w:t>mkt_name_Sana'a City</w:t>
-            </w:r>
-          </w:p>
-        </w:tc>
-        <w:tc>
-          <w:tcPr>
-            <w:tcW w:type="dxa" w:w="3360"/>
-          </w:tcPr>
-          <w:p>
-            <w:r>
-              <w:t>0.0205</w:t>
-            </w:r>
-          </w:p>
-        </w:tc>
-        <w:tc>
-          <w:tcPr>
-            <w:tcW w:type="dxa" w:w="3360"/>
-          </w:tcPr>
-          <w:p>
-            <w:r>
-              <w:t>مؤشر سوق صنعاء</w:t>
-            </w:r>
-          </w:p>
-        </w:tc>
-      </w:tr>
-      <w:tr>
-        <w:tc>
-          <w:tcPr>
-            <w:tcW w:type="dxa" w:w="3360"/>
-          </w:tcPr>
-          <w:p>
-            <w:r>
               <w:t>mkt_name_Aden City</w:t>
             </w:r>
           </w:p>
@@ -2628,7 +2622,7 @@
           </w:tcPr>
           <w:p>
             <w:r>
-              <w:t>0.0153</w:t>
+              <w:t>0.0170</w:t>
             </w:r>
           </w:p>
         </w:tc>
@@ -3424,6 +3418,12 @@
           <w:b w:val="0"/>
         </w:rPr>
         <w:t>This guide reflects the recorded implementation and results. Before formal submission, verify column names and metrics against the latest notebook run and CSV outputs; do not use figures from older graphics if they conflict with the corrected temporal validation. Add the official dataset reference, URL, and download/version date to the final academic submission.</w:t>
+      </w:r>
+    </w:p>
+    <w:p>
+      <w:pPr/>
+      <w:r>
+        <w:t>ملاحظة منهجية: استُبعد سجل الحد الفاصل من كل سوق في تقسيم الاختبار الزمني، لأن الهدف الشهري يعتمد على السعر في الفترة التالية. هذا إجراء محافظ، ولا يغيّر حقيقة أن الاختبار يحتوي على حالتين إيجابيتين فقط.</w:t>
       </w:r>
     </w:p>
     <w:sectPr>

</xml_diff>